<commit_message>
CGR PDF para entrega
</commit_message>
<xml_diff>
--- a/CGR/lab1_2_3/Lab 1 – Rede de campus guia de estudo.docx
+++ b/CGR/lab1_2_3/Lab 1 – Rede de campus guia de estudo.docx
@@ -9,11 +9,19 @@
           <w:lang w:val="pt-PT"/>
         </w:rPr>
       </w:pPr>
-      <w:r>
-        <w:rPr>
-          <w:lang w:val="pt-PT"/>
-        </w:rPr>
-        <w:t>Lab 1 – Rede de campus</w:t>
+      <w:proofErr w:type="spellStart"/>
+      <w:r>
+        <w:rPr>
+          <w:lang w:val="pt-PT"/>
+        </w:rPr>
+        <w:t>Lab</w:t>
+      </w:r>
+      <w:proofErr w:type="spellEnd"/>
+      <w:r>
+        <w:rPr>
+          <w:lang w:val="pt-PT"/>
+        </w:rPr>
+        <w:t xml:space="preserve"> 1 – Rede de campus</w:t>
       </w:r>
     </w:p>
     <w:p>
@@ -114,9 +122,11 @@
             <w:shd w:val="clear" w:color="auto" w:fill="F2F2F2"/>
           </w:tcPr>
           <w:p>
+            <w:proofErr w:type="spellStart"/>
             <w:r>
               <w:t>Endereços</w:t>
             </w:r>
+            <w:proofErr w:type="spellEnd"/>
           </w:p>
         </w:tc>
         <w:tc>
@@ -125,9 +135,11 @@
             <w:shd w:val="clear" w:color="auto" w:fill="F2F2F2"/>
           </w:tcPr>
           <w:p>
+            <w:proofErr w:type="spellStart"/>
             <w:r>
               <w:t>Notas</w:t>
             </w:r>
+            <w:proofErr w:type="spellEnd"/>
           </w:p>
         </w:tc>
       </w:tr>
@@ -201,7 +213,15 @@
               <w:t>.1</w:t>
             </w:r>
             <w:r>
-              <w:t xml:space="preserve"> na Distribution1, </w:t>
+              <w:t xml:space="preserve"> </w:t>
+            </w:r>
+            <w:proofErr w:type="spellStart"/>
+            <w:r>
+              <w:t>na</w:t>
+            </w:r>
+            <w:proofErr w:type="spellEnd"/>
+            <w:r>
+              <w:t xml:space="preserve"> Distribution1, </w:t>
             </w:r>
             <w:r>
               <w:rPr>
@@ -210,7 +230,15 @@
               <w:t>.2</w:t>
             </w:r>
             <w:r>
-              <w:t xml:space="preserve"> na Distribution2</w:t>
+              <w:t xml:space="preserve"> </w:t>
+            </w:r>
+            <w:proofErr w:type="spellStart"/>
+            <w:r>
+              <w:t>na</w:t>
+            </w:r>
+            <w:proofErr w:type="spellEnd"/>
+            <w:r>
+              <w:t xml:space="preserve"> Distribution2</w:t>
             </w:r>
           </w:p>
         </w:tc>
@@ -254,7 +282,15 @@
               <w:t>.1</w:t>
             </w:r>
             <w:r>
-              <w:t xml:space="preserve"> na Distribution1, </w:t>
+              <w:t xml:space="preserve"> </w:t>
+            </w:r>
+            <w:proofErr w:type="spellStart"/>
+            <w:r>
+              <w:t>na</w:t>
+            </w:r>
+            <w:proofErr w:type="spellEnd"/>
+            <w:r>
+              <w:t xml:space="preserve"> Distribution1, </w:t>
             </w:r>
             <w:r>
               <w:rPr>
@@ -263,7 +299,15 @@
               <w:t>.2</w:t>
             </w:r>
             <w:r>
-              <w:t xml:space="preserve"> na Distribution2</w:t>
+              <w:t xml:space="preserve"> </w:t>
+            </w:r>
+            <w:proofErr w:type="spellStart"/>
+            <w:r>
+              <w:t>na</w:t>
+            </w:r>
+            <w:proofErr w:type="spellEnd"/>
+            <w:r>
+              <w:t xml:space="preserve"> Distribution2</w:t>
             </w:r>
           </w:p>
         </w:tc>
@@ -274,8 +318,13 @@
             <w:tcW w:w="2223" w:type="dxa"/>
           </w:tcPr>
           <w:p>
-            <w:r>
-              <w:t>Sumário do pod</w:t>
+            <w:proofErr w:type="spellStart"/>
+            <w:r>
+              <w:t>Sumário</w:t>
+            </w:r>
+            <w:proofErr w:type="spellEnd"/>
+            <w:r>
+              <w:t xml:space="preserve"> do pod</w:t>
             </w:r>
           </w:p>
         </w:tc>
@@ -288,7 +337,21 @@
               <w:rPr>
                 <w:rStyle w:val="CodeChar"/>
               </w:rPr>
-              <w:t>10.8.0.0/22</w:t>
+              <w:t>10.8.</w:t>
+            </w:r>
+            <w:proofErr w:type="gramStart"/>
+            <w:r>
+              <w:rPr>
+                <w:rStyle w:val="CodeChar"/>
+              </w:rPr>
+              <w:t>0.0</w:t>
+            </w:r>
+            <w:proofErr w:type="gramEnd"/>
+            <w:r>
+              <w:rPr>
+                <w:rStyle w:val="CodeChar"/>
+              </w:rPr>
+              <w:t>/22</w:t>
             </w:r>
           </w:p>
         </w:tc>
@@ -306,7 +369,21 @@
               <w:rPr>
                 <w:lang w:val="pt-PT"/>
               </w:rPr>
-              <w:t>cobre as VLANs 2 e 3 numa só rota</w:t>
+              <w:t xml:space="preserve">cobre as </w:t>
+            </w:r>
+            <w:proofErr w:type="spellStart"/>
+            <w:r>
+              <w:rPr>
+                <w:lang w:val="pt-PT"/>
+              </w:rPr>
+              <w:t>VLANs</w:t>
+            </w:r>
+            <w:proofErr w:type="spellEnd"/>
+            <w:r>
+              <w:rPr>
+                <w:lang w:val="pt-PT"/>
+              </w:rPr>
+              <w:t xml:space="preserve"> 2 e 3 numa só rota</w:t>
             </w:r>
           </w:p>
         </w:tc>
@@ -334,7 +411,15 @@
               <w:t>/30</w:t>
             </w:r>
             <w:r>
-              <w:t xml:space="preserve"> a partir de </w:t>
+              <w:t xml:space="preserve"> a </w:t>
+            </w:r>
+            <w:proofErr w:type="spellStart"/>
+            <w:r>
+              <w:t>partir</w:t>
+            </w:r>
+            <w:proofErr w:type="spellEnd"/>
+            <w:r>
+              <w:t xml:space="preserve"> de </w:t>
             </w:r>
             <w:r>
               <w:rPr>
@@ -350,8 +435,21 @@
           </w:tcPr>
           <w:p>
             <w:r>
-              <w:t>um /30 por cabo</w:t>
-            </w:r>
+              <w:t xml:space="preserve">um /30 </w:t>
+            </w:r>
+            <w:proofErr w:type="spellStart"/>
+            <w:r>
+              <w:t>por</w:t>
+            </w:r>
+            <w:proofErr w:type="spellEnd"/>
+            <w:r>
+              <w:t xml:space="preserve"> </w:t>
+            </w:r>
+            <w:proofErr w:type="spellStart"/>
+            <w:r>
+              <w:t>cabo</w:t>
+            </w:r>
+            <w:proofErr w:type="spellEnd"/>
           </w:p>
         </w:tc>
       </w:tr>
@@ -394,7 +492,15 @@
               <w:t>.1</w:t>
             </w:r>
             <w:r>
-              <w:t xml:space="preserve">, servidor </w:t>
+              <w:t xml:space="preserve">, </w:t>
+            </w:r>
+            <w:proofErr w:type="spellStart"/>
+            <w:r>
+              <w:t>servidor</w:t>
+            </w:r>
+            <w:proofErr w:type="spellEnd"/>
+            <w:r>
+              <w:t xml:space="preserve"> </w:t>
             </w:r>
             <w:r>
               <w:rPr>
@@ -412,7 +518,15 @@
           </w:tcPr>
           <w:p>
             <w:r>
-              <w:t>Internet (simulada)</w:t>
+              <w:t>Internet (</w:t>
+            </w:r>
+            <w:proofErr w:type="spellStart"/>
+            <w:r>
+              <w:t>simulada</w:t>
+            </w:r>
+            <w:proofErr w:type="spellEnd"/>
+            <w:r>
+              <w:t>)</w:t>
             </w:r>
           </w:p>
         </w:tc>
@@ -489,17 +603,25 @@
                 <w:lang w:val="pt-PT"/>
               </w:rPr>
             </w:pPr>
+            <w:proofErr w:type="spellStart"/>
             <w:r>
               <w:rPr>
                 <w:lang w:val="pt-PT"/>
               </w:rPr>
-              <w:t xml:space="preserve">spines </w:t>
-            </w:r>
-            <w:r>
-              <w:rPr>
-                <w:rStyle w:val="CodeChar"/>
+              <w:t>spines</w:t>
+            </w:r>
+            <w:proofErr w:type="spellEnd"/>
+            <w:r>
+              <w:rPr>
                 <w:lang w:val="pt-PT"/>
               </w:rPr>
+              <w:t xml:space="preserve"> </w:t>
+            </w:r>
+            <w:r>
+              <w:rPr>
+                <w:rStyle w:val="CodeChar"/>
+                <w:lang w:val="pt-PT"/>
+              </w:rPr>
               <w:t>.1</w:t>
             </w:r>
             <w:r>
@@ -519,20 +641,48 @@
               <w:rPr>
                 <w:lang w:val="pt-PT"/>
               </w:rPr>
-              <w:t xml:space="preserve">, Border </w:t>
-            </w:r>
-            <w:r>
-              <w:rPr>
-                <w:rStyle w:val="CodeChar"/>
+              <w:t xml:space="preserve">, </w:t>
+            </w:r>
+            <w:proofErr w:type="spellStart"/>
+            <w:r>
+              <w:rPr>
                 <w:lang w:val="pt-PT"/>
               </w:rPr>
+              <w:t>Border</w:t>
+            </w:r>
+            <w:proofErr w:type="spellEnd"/>
+            <w:r>
+              <w:rPr>
+                <w:lang w:val="pt-PT"/>
+              </w:rPr>
+              <w:t xml:space="preserve"> </w:t>
+            </w:r>
+            <w:r>
+              <w:rPr>
+                <w:rStyle w:val="CodeChar"/>
+                <w:lang w:val="pt-PT"/>
+              </w:rPr>
               <w:t>.3</w:t>
             </w:r>
             <w:r>
               <w:rPr>
                 <w:lang w:val="pt-PT"/>
               </w:rPr>
-              <w:t xml:space="preserve">, rack </w:t>
+              <w:t xml:space="preserve">, </w:t>
+            </w:r>
+            <w:proofErr w:type="spellStart"/>
+            <w:r>
+              <w:rPr>
+                <w:lang w:val="pt-PT"/>
+              </w:rPr>
+              <w:t>rack</w:t>
+            </w:r>
+            <w:proofErr w:type="spellEnd"/>
+            <w:r>
+              <w:rPr>
+                <w:lang w:val="pt-PT"/>
+              </w:rPr>
+              <w:t xml:space="preserve"> </w:t>
             </w:r>
             <w:r>
               <w:rPr>
@@ -576,8 +726,13 @@
             <w:tcW w:w="2223" w:type="dxa"/>
           </w:tcPr>
           <w:p>
-            <w:r>
-              <w:t>Gestão (</w:t>
+            <w:proofErr w:type="spellStart"/>
+            <w:r>
+              <w:t>Gestão</w:t>
+            </w:r>
+            <w:proofErr w:type="spellEnd"/>
+            <w:r>
+              <w:t xml:space="preserve"> (</w:t>
             </w:r>
             <w:r>
               <w:rPr>
@@ -599,8 +754,16 @@
               <w:rPr>
                 <w:rStyle w:val="CodeChar"/>
               </w:rPr>
-              <w:t>192.168.200.x</w:t>
-            </w:r>
+              <w:t>192.</w:t>
+            </w:r>
+            <w:proofErr w:type="gramStart"/>
+            <w:r>
+              <w:rPr>
+                <w:rStyle w:val="CodeChar"/>
+              </w:rPr>
+              <w:t>168.200.x</w:t>
+            </w:r>
+            <w:proofErr w:type="gramEnd"/>
           </w:p>
         </w:tc>
         <w:tc>
@@ -659,7 +822,21 @@
         <w:rPr>
           <w:lang w:val="pt-PT"/>
         </w:rPr>
-        <w:t xml:space="preserve"> para os spines verem uma só rota para o </w:t>
+        <w:t xml:space="preserve"> para os </w:t>
+      </w:r>
+      <w:proofErr w:type="spellStart"/>
+      <w:r>
+        <w:rPr>
+          <w:lang w:val="pt-PT"/>
+        </w:rPr>
+        <w:t>spines</w:t>
+      </w:r>
+      <w:proofErr w:type="spellEnd"/>
+      <w:r>
+        <w:rPr>
+          <w:lang w:val="pt-PT"/>
+        </w:rPr>
+        <w:t xml:space="preserve"> verem uma só rota para o </w:t>
       </w:r>
       <w:r>
         <w:rPr>
@@ -671,7 +848,21 @@
         <w:rPr>
           <w:lang w:val="pt-PT"/>
         </w:rPr>
-        <w:t xml:space="preserve"> em vez de uma por VLAN. As VLANs 2 e 3 (</w:t>
+        <w:t xml:space="preserve"> em vez de uma por VLAN. As </w:t>
+      </w:r>
+      <w:proofErr w:type="spellStart"/>
+      <w:r>
+        <w:rPr>
+          <w:lang w:val="pt-PT"/>
+        </w:rPr>
+        <w:t>VLANs</w:t>
+      </w:r>
+      <w:proofErr w:type="spellEnd"/>
+      <w:r>
+        <w:rPr>
+          <w:lang w:val="pt-PT"/>
+        </w:rPr>
+        <w:t xml:space="preserve"> 2 e 3 (</w:t>
       </w:r>
       <w:r>
         <w:rPr>
@@ -763,7 +954,77 @@
         <w:rPr>
           <w:lang w:val="pt-PT"/>
         </w:rPr>
-        <w:t>Cada distribuição tem dois links a cada spine, e o mesmo acontece entre os spines, o Border e o rack. São links L3 separados (cada um com o seu /30), não bonds, e dão redundância: se um cabo falha, há outro.</w:t>
+        <w:t xml:space="preserve">Cada distribuição tem dois links a cada </w:t>
+      </w:r>
+      <w:proofErr w:type="spellStart"/>
+      <w:r>
+        <w:rPr>
+          <w:lang w:val="pt-PT"/>
+        </w:rPr>
+        <w:t>spine</w:t>
+      </w:r>
+      <w:proofErr w:type="spellEnd"/>
+      <w:r>
+        <w:rPr>
+          <w:lang w:val="pt-PT"/>
+        </w:rPr>
+        <w:t xml:space="preserve">, e o mesmo acontece entre os </w:t>
+      </w:r>
+      <w:proofErr w:type="spellStart"/>
+      <w:r>
+        <w:rPr>
+          <w:lang w:val="pt-PT"/>
+        </w:rPr>
+        <w:t>spines</w:t>
+      </w:r>
+      <w:proofErr w:type="spellEnd"/>
+      <w:r>
+        <w:rPr>
+          <w:lang w:val="pt-PT"/>
+        </w:rPr>
+        <w:t xml:space="preserve">, o </w:t>
+      </w:r>
+      <w:proofErr w:type="spellStart"/>
+      <w:r>
+        <w:rPr>
+          <w:lang w:val="pt-PT"/>
+        </w:rPr>
+        <w:t>Border</w:t>
+      </w:r>
+      <w:proofErr w:type="spellEnd"/>
+      <w:r>
+        <w:rPr>
+          <w:lang w:val="pt-PT"/>
+        </w:rPr>
+        <w:t xml:space="preserve"> e o </w:t>
+      </w:r>
+      <w:proofErr w:type="spellStart"/>
+      <w:r>
+        <w:rPr>
+          <w:lang w:val="pt-PT"/>
+        </w:rPr>
+        <w:t>rack</w:t>
+      </w:r>
+      <w:proofErr w:type="spellEnd"/>
+      <w:r>
+        <w:rPr>
+          <w:lang w:val="pt-PT"/>
+        </w:rPr>
+        <w:t xml:space="preserve">. São links L3 separados (cada um com o seu /30), não </w:t>
+      </w:r>
+      <w:proofErr w:type="spellStart"/>
+      <w:r>
+        <w:rPr>
+          <w:lang w:val="pt-PT"/>
+        </w:rPr>
+        <w:t>bonds</w:t>
+      </w:r>
+      <w:proofErr w:type="spellEnd"/>
+      <w:r>
+        <w:rPr>
+          <w:lang w:val="pt-PT"/>
+        </w:rPr>
+        <w:t>, e dão redundância: se um cabo falha, há outro.</w:t>
       </w:r>
     </w:p>
     <w:tbl>
@@ -1911,7 +2172,15 @@
           </w:tcPr>
           <w:p>
             <w:r>
-              <w:t>VLAN no cenário 1</w:t>
+              <w:t xml:space="preserve">VLAN no </w:t>
+            </w:r>
+            <w:proofErr w:type="spellStart"/>
+            <w:r>
+              <w:t>cenário</w:t>
+            </w:r>
+            <w:proofErr w:type="spellEnd"/>
+            <w:r>
+              <w:t xml:space="preserve"> 1</w:t>
             </w:r>
           </w:p>
         </w:tc>
@@ -1922,7 +2191,15 @@
           </w:tcPr>
           <w:p>
             <w:r>
-              <w:t>VLAN no cenário 2</w:t>
+              <w:t xml:space="preserve">VLAN no </w:t>
+            </w:r>
+            <w:proofErr w:type="spellStart"/>
+            <w:r>
+              <w:t>cenário</w:t>
+            </w:r>
+            <w:proofErr w:type="spellEnd"/>
+            <w:r>
+              <w:t xml:space="preserve"> 2</w:t>
             </w:r>
           </w:p>
         </w:tc>
@@ -1932,9 +2209,11 @@
             <w:shd w:val="clear" w:color="auto" w:fill="F2F2F2"/>
           </w:tcPr>
           <w:p>
+            <w:proofErr w:type="spellStart"/>
             <w:r>
               <w:t>Endereço</w:t>
             </w:r>
+            <w:proofErr w:type="spellEnd"/>
           </w:p>
         </w:tc>
       </w:tr>
@@ -2216,9 +2495,11 @@
             <w:tcW w:w="1897" w:type="dxa"/>
           </w:tcPr>
           <w:p>
+            <w:proofErr w:type="spellStart"/>
             <w:r>
               <w:t>UbuntuInternet</w:t>
             </w:r>
+            <w:proofErr w:type="spellEnd"/>
           </w:p>
         </w:tc>
         <w:tc>
@@ -2311,7 +2592,21 @@
         <w:rPr>
           <w:lang w:val="pt-PT"/>
         </w:rPr>
-        <w:t xml:space="preserve"> (gateway </w:t>
+        <w:t xml:space="preserve"> (</w:t>
+      </w:r>
+      <w:proofErr w:type="spellStart"/>
+      <w:r>
+        <w:rPr>
+          <w:lang w:val="pt-PT"/>
+        </w:rPr>
+        <w:t>gateway</w:t>
+      </w:r>
+      <w:proofErr w:type="spellEnd"/>
+      <w:r>
+        <w:rPr>
+          <w:lang w:val="pt-PT"/>
+        </w:rPr>
+        <w:t xml:space="preserve"> </w:t>
       </w:r>
       <w:r>
         <w:rPr>
@@ -2350,7 +2645,21 @@
         <w:rPr>
           <w:lang w:val="pt-PT"/>
         </w:rPr>
-        <w:t xml:space="preserve"> (gateway </w:t>
+        <w:t xml:space="preserve"> (</w:t>
+      </w:r>
+      <w:proofErr w:type="spellStart"/>
+      <w:r>
+        <w:rPr>
+          <w:lang w:val="pt-PT"/>
+        </w:rPr>
+        <w:t>gateway</w:t>
+      </w:r>
+      <w:proofErr w:type="spellEnd"/>
+      <w:r>
+        <w:rPr>
+          <w:lang w:val="pt-PT"/>
+        </w:rPr>
+        <w:t xml:space="preserve"> </w:t>
       </w:r>
       <w:r>
         <w:rPr>
@@ -2377,7 +2686,35 @@
         <w:rPr>
           <w:lang w:val="pt-PT"/>
         </w:rPr>
-        <w:t>3. Camada 2: bonds, VLANs e STP</w:t>
+        <w:t xml:space="preserve">3. Camada 2: </w:t>
+      </w:r>
+      <w:proofErr w:type="spellStart"/>
+      <w:r>
+        <w:rPr>
+          <w:lang w:val="pt-PT"/>
+        </w:rPr>
+        <w:t>bonds</w:t>
+      </w:r>
+      <w:proofErr w:type="spellEnd"/>
+      <w:r>
+        <w:rPr>
+          <w:lang w:val="pt-PT"/>
+        </w:rPr>
+        <w:t xml:space="preserve">, </w:t>
+      </w:r>
+      <w:proofErr w:type="spellStart"/>
+      <w:r>
+        <w:rPr>
+          <w:lang w:val="pt-PT"/>
+        </w:rPr>
+        <w:t>VLANs</w:t>
+      </w:r>
+      <w:proofErr w:type="spellEnd"/>
+      <w:r>
+        <w:rPr>
+          <w:lang w:val="pt-PT"/>
+        </w:rPr>
+        <w:t xml:space="preserve"> e STP</w:t>
       </w:r>
     </w:p>
     <w:p>
@@ -2390,7 +2727,49 @@
         <w:rPr>
           <w:lang w:val="pt-PT"/>
         </w:rPr>
-        <w:t>Todos os links L2 são bonds LACP de 2 cabos, as VLANs vivem numa bridge e o STP bloqueia os loops.</w:t>
+        <w:t xml:space="preserve">Todos os links L2 são </w:t>
+      </w:r>
+      <w:proofErr w:type="spellStart"/>
+      <w:r>
+        <w:rPr>
+          <w:lang w:val="pt-PT"/>
+        </w:rPr>
+        <w:t>bonds</w:t>
+      </w:r>
+      <w:proofErr w:type="spellEnd"/>
+      <w:r>
+        <w:rPr>
+          <w:lang w:val="pt-PT"/>
+        </w:rPr>
+        <w:t xml:space="preserve"> LACP de 2 cabos, as </w:t>
+      </w:r>
+      <w:proofErr w:type="spellStart"/>
+      <w:r>
+        <w:rPr>
+          <w:lang w:val="pt-PT"/>
+        </w:rPr>
+        <w:t>VLANs</w:t>
+      </w:r>
+      <w:proofErr w:type="spellEnd"/>
+      <w:r>
+        <w:rPr>
+          <w:lang w:val="pt-PT"/>
+        </w:rPr>
+        <w:t xml:space="preserve"> vivem numa bridge e o STP bloqueia os </w:t>
+      </w:r>
+      <w:proofErr w:type="spellStart"/>
+      <w:r>
+        <w:rPr>
+          <w:lang w:val="pt-PT"/>
+        </w:rPr>
+        <w:t>loops</w:t>
+      </w:r>
+      <w:proofErr w:type="spellEnd"/>
+      <w:r>
+        <w:rPr>
+          <w:lang w:val="pt-PT"/>
+        </w:rPr>
+        <w:t>.</w:t>
       </w:r>
     </w:p>
     <w:p>
@@ -2399,7 +2778,7 @@
       </w:pPr>
       <w:r>
         <w:lastRenderedPageBreak/>
-        <w:t>Bonds (LACP, 802.3ad)</w:t>
+        <w:t xml:space="preserve">Bonds </w:t>
       </w:r>
     </w:p>
     <w:p>
@@ -2476,7 +2855,35 @@
         <w:rPr>
           <w:lang w:val="pt-PT"/>
         </w:rPr>
-        <w:t xml:space="preserve"> não são bond: são as portas dos hosts.</w:t>
+        <w:t xml:space="preserve"> não são </w:t>
+      </w:r>
+      <w:proofErr w:type="spellStart"/>
+      <w:r>
+        <w:rPr>
+          <w:lang w:val="pt-PT"/>
+        </w:rPr>
+        <w:t>bond</w:t>
+      </w:r>
+      <w:proofErr w:type="spellEnd"/>
+      <w:r>
+        <w:rPr>
+          <w:lang w:val="pt-PT"/>
+        </w:rPr>
+        <w:t xml:space="preserve">: são as portas dos </w:t>
+      </w:r>
+      <w:proofErr w:type="spellStart"/>
+      <w:r>
+        <w:rPr>
+          <w:lang w:val="pt-PT"/>
+        </w:rPr>
+        <w:t>hosts</w:t>
+      </w:r>
+      <w:proofErr w:type="spellEnd"/>
+      <w:r>
+        <w:rPr>
+          <w:lang w:val="pt-PT"/>
+        </w:rPr>
+        <w:t>.</w:t>
       </w:r>
     </w:p>
     <w:p>
@@ -2487,6 +2894,7 @@
           <w:numId w:val="3"/>
         </w:numPr>
         <w:rPr>
+          <w:bCs/>
           <w:lang w:val="pt-PT"/>
         </w:rPr>
       </w:pPr>
@@ -2544,16 +2952,10 @@
       </w:r>
       <w:r>
         <w:rPr>
-          <w:b/>
-          <w:lang w:val="pt-PT"/>
-        </w:rPr>
-        <w:t>entre as duas distribuições</w:t>
-      </w:r>
-      <w:r>
-        <w:rPr>
-          <w:lang w:val="pt-PT"/>
-        </w:rPr>
-        <w:t>.</w:t>
+          <w:bCs/>
+          <w:lang w:val="pt-PT"/>
+        </w:rPr>
+        <w:t>entre as duas distribuições.</w:t>
       </w:r>
     </w:p>
     <w:p>
@@ -2586,7 +2988,7 @@
         <w:pStyle w:val="Ttulo3"/>
       </w:pPr>
       <w:r>
-        <w:t>Bridge com VLANs (VLAN-aware)</w:t>
+        <w:t xml:space="preserve">Bridge com VLANs </w:t>
       </w:r>
     </w:p>
     <w:p>
@@ -2599,7 +3001,21 @@
         <w:rPr>
           <w:lang w:val="pt-PT"/>
         </w:rPr>
-        <w:t xml:space="preserve">Em cada switch há uma </w:t>
+        <w:t xml:space="preserve">Em cada </w:t>
+      </w:r>
+      <w:proofErr w:type="spellStart"/>
+      <w:r>
+        <w:rPr>
+          <w:lang w:val="pt-PT"/>
+        </w:rPr>
+        <w:t>switch</w:t>
+      </w:r>
+      <w:proofErr w:type="spellEnd"/>
+      <w:r>
+        <w:rPr>
+          <w:lang w:val="pt-PT"/>
+        </w:rPr>
+        <w:t xml:space="preserve"> há uma </w:t>
       </w:r>
       <w:r>
         <w:rPr>
@@ -2612,15 +3028,52 @@
         <w:rPr>
           <w:lang w:val="pt-PT"/>
         </w:rPr>
-        <w:t xml:space="preserve"> com os bonds e as portas de acesso lá dentro, e as VLANs permitidas em </w:t>
+        <w:t xml:space="preserve"> com os </w:t>
+      </w:r>
+      <w:proofErr w:type="spellStart"/>
+      <w:r>
+        <w:rPr>
+          <w:lang w:val="pt-PT"/>
+        </w:rPr>
+        <w:t>bonds</w:t>
+      </w:r>
+      <w:proofErr w:type="spellEnd"/>
+      <w:r>
+        <w:rPr>
+          <w:lang w:val="pt-PT"/>
+        </w:rPr>
+        <w:t xml:space="preserve"> e as portas de acesso lá dentro, e as </w:t>
+      </w:r>
+      <w:proofErr w:type="spellStart"/>
+      <w:r>
+        <w:rPr>
+          <w:lang w:val="pt-PT"/>
+        </w:rPr>
+        <w:t>VLANs</w:t>
+      </w:r>
+      <w:proofErr w:type="spellEnd"/>
+      <w:r>
+        <w:rPr>
+          <w:lang w:val="pt-PT"/>
+        </w:rPr>
+        <w:t xml:space="preserve"> permitidas em </w:t>
       </w:r>
       <w:r>
         <w:rPr>
           <w:rStyle w:val="CodeChar"/>
           <w:lang w:val="pt-PT"/>
         </w:rPr>
-        <w:t>bridge-vids</w:t>
-      </w:r>
+        <w:t>bridge-</w:t>
+      </w:r>
+      <w:proofErr w:type="spellStart"/>
+      <w:r>
+        <w:rPr>
+          <w:rStyle w:val="CodeChar"/>
+          <w:lang w:val="pt-PT"/>
+        </w:rPr>
+        <w:t>vids</w:t>
+      </w:r>
+      <w:proofErr w:type="spellEnd"/>
       <w:r>
         <w:rPr>
           <w:lang w:val="pt-PT"/>
@@ -2657,13 +3110,57 @@
           <w:rStyle w:val="CodeChar"/>
           <w:lang w:val="pt-PT"/>
         </w:rPr>
-        <w:t>bridge-access 2</w:t>
-      </w:r>
-      <w:r>
-        <w:rPr>
-          <w:lang w:val="pt-PT"/>
-        </w:rPr>
-        <w:t>): o host não vê tags, e a porta pertence a uma só VLAN.</w:t>
+        <w:t>bridge-</w:t>
+      </w:r>
+      <w:proofErr w:type="spellStart"/>
+      <w:r>
+        <w:rPr>
+          <w:rStyle w:val="CodeChar"/>
+          <w:lang w:val="pt-PT"/>
+        </w:rPr>
+        <w:t>access</w:t>
+      </w:r>
+      <w:proofErr w:type="spellEnd"/>
+      <w:r>
+        <w:rPr>
+          <w:rStyle w:val="CodeChar"/>
+          <w:lang w:val="pt-PT"/>
+        </w:rPr>
+        <w:t xml:space="preserve"> 2</w:t>
+      </w:r>
+      <w:r>
+        <w:rPr>
+          <w:lang w:val="pt-PT"/>
+        </w:rPr>
+        <w:t xml:space="preserve">): o </w:t>
+      </w:r>
+      <w:proofErr w:type="spellStart"/>
+      <w:r>
+        <w:rPr>
+          <w:lang w:val="pt-PT"/>
+        </w:rPr>
+        <w:t>host</w:t>
+      </w:r>
+      <w:proofErr w:type="spellEnd"/>
+      <w:r>
+        <w:rPr>
+          <w:lang w:val="pt-PT"/>
+        </w:rPr>
+        <w:t xml:space="preserve"> não vê </w:t>
+      </w:r>
+      <w:proofErr w:type="spellStart"/>
+      <w:r>
+        <w:rPr>
+          <w:lang w:val="pt-PT"/>
+        </w:rPr>
+        <w:t>tags</w:t>
+      </w:r>
+      <w:proofErr w:type="spellEnd"/>
+      <w:r>
+        <w:rPr>
+          <w:lang w:val="pt-PT"/>
+        </w:rPr>
+        <w:t>, e a porta pertence a uma só VLAN.</w:t>
       </w:r>
     </w:p>
     <w:p>
@@ -2677,6 +3174,7 @@
           <w:lang w:val="pt-PT"/>
         </w:rPr>
       </w:pPr>
+      <w:proofErr w:type="spellStart"/>
       <w:r>
         <w:rPr>
           <w:b/>
@@ -2684,11 +3182,54 @@
         </w:rPr>
         <w:t>Trunk</w:t>
       </w:r>
-      <w:r>
-        <w:rPr>
-          <w:lang w:val="pt-PT"/>
-        </w:rPr>
-        <w:t xml:space="preserve"> (os bonds): leva várias VLANs, com tag 802.1Q.</w:t>
+      <w:proofErr w:type="spellEnd"/>
+      <w:r>
+        <w:rPr>
+          <w:lang w:val="pt-PT"/>
+        </w:rPr>
+        <w:t xml:space="preserve"> (os </w:t>
+      </w:r>
+      <w:proofErr w:type="spellStart"/>
+      <w:r>
+        <w:rPr>
+          <w:lang w:val="pt-PT"/>
+        </w:rPr>
+        <w:t>bonds</w:t>
+      </w:r>
+      <w:proofErr w:type="spellEnd"/>
+      <w:r>
+        <w:rPr>
+          <w:lang w:val="pt-PT"/>
+        </w:rPr>
+        <w:t xml:space="preserve">): leva várias </w:t>
+      </w:r>
+      <w:proofErr w:type="spellStart"/>
+      <w:r>
+        <w:rPr>
+          <w:lang w:val="pt-PT"/>
+        </w:rPr>
+        <w:t>VLANs</w:t>
+      </w:r>
+      <w:proofErr w:type="spellEnd"/>
+      <w:r>
+        <w:rPr>
+          <w:lang w:val="pt-PT"/>
+        </w:rPr>
+        <w:t xml:space="preserve">, com </w:t>
+      </w:r>
+      <w:proofErr w:type="spellStart"/>
+      <w:r>
+        <w:rPr>
+          <w:lang w:val="pt-PT"/>
+        </w:rPr>
+        <w:t>tag</w:t>
+      </w:r>
+      <w:proofErr w:type="spellEnd"/>
+      <w:r>
+        <w:rPr>
+          <w:lang w:val="pt-PT"/>
+        </w:rPr>
+        <w:t xml:space="preserve"> 802.1Q.</w:t>
       </w:r>
     </w:p>
     <w:p>
@@ -2762,10 +3303,48 @@
         <w:rPr>
           <w:lang w:val="pt-PT"/>
         </w:rPr>
-        <w:t xml:space="preserve">Há loops em L2 (cada acesso liga às duas distribuições, e as distribuições ligam-se entre si). </w:t>
-      </w:r>
-      <w:r>
-        <w:t>O STP bloqueia um caminho por loop.</w:t>
+        <w:t xml:space="preserve">Há </w:t>
+      </w:r>
+      <w:proofErr w:type="spellStart"/>
+      <w:r>
+        <w:rPr>
+          <w:lang w:val="pt-PT"/>
+        </w:rPr>
+        <w:t>loops</w:t>
+      </w:r>
+      <w:proofErr w:type="spellEnd"/>
+      <w:r>
+        <w:rPr>
+          <w:lang w:val="pt-PT"/>
+        </w:rPr>
+        <w:t xml:space="preserve"> em L2 (cada acesso liga às duas distribuições, e as distribuições ligam-se entre si). </w:t>
+      </w:r>
+      <w:r>
+        <w:t xml:space="preserve">O STP </w:t>
+      </w:r>
+      <w:proofErr w:type="spellStart"/>
+      <w:r>
+        <w:t>bloqueia</w:t>
+      </w:r>
+      <w:proofErr w:type="spellEnd"/>
+      <w:r>
+        <w:t xml:space="preserve"> um </w:t>
+      </w:r>
+      <w:proofErr w:type="spellStart"/>
+      <w:r>
+        <w:t>caminho</w:t>
+      </w:r>
+      <w:proofErr w:type="spellEnd"/>
+      <w:r>
+        <w:t xml:space="preserve"> </w:t>
+      </w:r>
+      <w:proofErr w:type="spellStart"/>
+      <w:r>
+        <w:t>por</w:t>
+      </w:r>
+      <w:proofErr w:type="spellEnd"/>
+      <w:r>
+        <w:t xml:space="preserve"> loop.</w:t>
       </w:r>
     </w:p>
     <w:p>
@@ -2783,7 +3362,21 @@
         <w:rPr>
           <w:lang w:val="pt-PT"/>
         </w:rPr>
-        <w:t>Uma só instância (802.1D) para todas as VLANs.</w:t>
+        <w:t xml:space="preserve">Uma só instância para todas as </w:t>
+      </w:r>
+      <w:proofErr w:type="spellStart"/>
+      <w:r>
+        <w:rPr>
+          <w:lang w:val="pt-PT"/>
+        </w:rPr>
+        <w:t>VLANs</w:t>
+      </w:r>
+      <w:proofErr w:type="spellEnd"/>
+      <w:r>
+        <w:rPr>
+          <w:lang w:val="pt-PT"/>
+        </w:rPr>
+        <w:t>.</w:t>
       </w:r>
     </w:p>
     <w:p>
@@ -2854,8 +3447,23 @@
         <w:rPr>
           <w:lang w:val="pt-PT"/>
         </w:rPr>
-        <w:t xml:space="preserve">Cada acesso fica com um dos bonds em </w:t>
-      </w:r>
+        <w:t xml:space="preserve">Cada acesso fica com um dos </w:t>
+      </w:r>
+      <w:proofErr w:type="spellStart"/>
+      <w:r>
+        <w:rPr>
+          <w:lang w:val="pt-PT"/>
+        </w:rPr>
+        <w:t>bonds</w:t>
+      </w:r>
+      <w:proofErr w:type="spellEnd"/>
+      <w:r>
+        <w:rPr>
+          <w:lang w:val="pt-PT"/>
+        </w:rPr>
+        <w:t xml:space="preserve"> em </w:t>
+      </w:r>
+      <w:proofErr w:type="spellStart"/>
       <w:r>
         <w:rPr>
           <w:i/>
@@ -2863,6 +3471,7 @@
         </w:rPr>
         <w:t>blocking</w:t>
       </w:r>
+      <w:proofErr w:type="spellEnd"/>
       <w:r>
         <w:rPr>
           <w:lang w:val="pt-PT"/>
@@ -2879,7 +3488,23 @@
         <w:t>bridge link</w:t>
       </w:r>
       <w:r>
-        <w:t xml:space="preserve"> mostra isso.</w:t>
+        <w:t xml:space="preserve"> </w:t>
+      </w:r>
+      <w:proofErr w:type="spellStart"/>
+      <w:r>
+        <w:t>mostra</w:t>
+      </w:r>
+      <w:proofErr w:type="spellEnd"/>
+      <w:r>
+        <w:t xml:space="preserve"> </w:t>
+      </w:r>
+      <w:proofErr w:type="spellStart"/>
+      <w:r>
+        <w:t>isso</w:t>
+      </w:r>
+      <w:proofErr w:type="spellEnd"/>
+      <w:r>
+        <w:t>.</w:t>
       </w:r>
     </w:p>
     <w:p>
@@ -2893,7 +3518,21 @@
         <w:rPr>
           <w:lang w:val="pt-PT"/>
         </w:rPr>
-        <w:t>4. Camada 3: SVIs, OSPF e rota por omissão</w:t>
+        <w:t xml:space="preserve">4. Camada 3: </w:t>
+      </w:r>
+      <w:proofErr w:type="spellStart"/>
+      <w:r>
+        <w:rPr>
+          <w:lang w:val="pt-PT"/>
+        </w:rPr>
+        <w:t>SVIs</w:t>
+      </w:r>
+      <w:proofErr w:type="spellEnd"/>
+      <w:r>
+        <w:rPr>
+          <w:lang w:val="pt-PT"/>
+        </w:rPr>
+        <w:t>, OSPF e rota por omissão</w:t>
       </w:r>
     </w:p>
     <w:p>
@@ -2906,7 +3545,77 @@
         <w:rPr>
           <w:lang w:val="pt-PT"/>
         </w:rPr>
-        <w:t>As SVIs dão o gateway às VLANs, o OSPF distribui as rotas em duas áreas e o Border injeta a default.</w:t>
+        <w:t xml:space="preserve">As </w:t>
+      </w:r>
+      <w:proofErr w:type="spellStart"/>
+      <w:r>
+        <w:rPr>
+          <w:lang w:val="pt-PT"/>
+        </w:rPr>
+        <w:t>SVIs</w:t>
+      </w:r>
+      <w:proofErr w:type="spellEnd"/>
+      <w:r>
+        <w:rPr>
+          <w:lang w:val="pt-PT"/>
+        </w:rPr>
+        <w:t xml:space="preserve"> dão o </w:t>
+      </w:r>
+      <w:proofErr w:type="spellStart"/>
+      <w:r>
+        <w:rPr>
+          <w:lang w:val="pt-PT"/>
+        </w:rPr>
+        <w:t>gateway</w:t>
+      </w:r>
+      <w:proofErr w:type="spellEnd"/>
+      <w:r>
+        <w:rPr>
+          <w:lang w:val="pt-PT"/>
+        </w:rPr>
+        <w:t xml:space="preserve"> às </w:t>
+      </w:r>
+      <w:proofErr w:type="spellStart"/>
+      <w:r>
+        <w:rPr>
+          <w:lang w:val="pt-PT"/>
+        </w:rPr>
+        <w:t>VLANs</w:t>
+      </w:r>
+      <w:proofErr w:type="spellEnd"/>
+      <w:r>
+        <w:rPr>
+          <w:lang w:val="pt-PT"/>
+        </w:rPr>
+        <w:t xml:space="preserve">, o OSPF distribui as rotas em duas áreas e o </w:t>
+      </w:r>
+      <w:proofErr w:type="spellStart"/>
+      <w:r>
+        <w:rPr>
+          <w:lang w:val="pt-PT"/>
+        </w:rPr>
+        <w:t>Border</w:t>
+      </w:r>
+      <w:proofErr w:type="spellEnd"/>
+      <w:r>
+        <w:rPr>
+          <w:lang w:val="pt-PT"/>
+        </w:rPr>
+        <w:t xml:space="preserve"> injeta a </w:t>
+      </w:r>
+      <w:proofErr w:type="spellStart"/>
+      <w:r>
+        <w:rPr>
+          <w:lang w:val="pt-PT"/>
+        </w:rPr>
+        <w:t>default</w:t>
+      </w:r>
+      <w:proofErr w:type="spellEnd"/>
+      <w:r>
+        <w:rPr>
+          <w:lang w:val="pt-PT"/>
+        </w:rPr>
+        <w:t>.</w:t>
       </w:r>
     </w:p>
     <w:p>
@@ -2916,11 +3625,19 @@
           <w:lang w:val="pt-PT"/>
         </w:rPr>
       </w:pPr>
-      <w:r>
-        <w:rPr>
-          <w:lang w:val="pt-PT"/>
-        </w:rPr>
-        <w:t>SVIs (</w:t>
+      <w:proofErr w:type="spellStart"/>
+      <w:r>
+        <w:rPr>
+          <w:lang w:val="pt-PT"/>
+        </w:rPr>
+        <w:t>SVIs</w:t>
+      </w:r>
+      <w:proofErr w:type="spellEnd"/>
+      <w:r>
+        <w:rPr>
+          <w:lang w:val="pt-PT"/>
+        </w:rPr>
+        <w:t xml:space="preserve"> (</w:t>
       </w:r>
       <w:r>
         <w:rPr>
@@ -2961,6 +3678,7 @@
         </w:rPr>
         <w:t xml:space="preserve">Uma SVI é a interface L3 de uma VLAN dentro da distribuição, o </w:t>
       </w:r>
+      <w:proofErr w:type="spellStart"/>
       <w:r>
         <w:rPr>
           <w:b/>
@@ -2968,24 +3686,85 @@
         </w:rPr>
         <w:t>gateway</w:t>
       </w:r>
-      <w:r>
-        <w:rPr>
-          <w:lang w:val="pt-PT"/>
-        </w:rPr>
-        <w:t xml:space="preserve"> dos hosts dessa VLAN. Faz o </w:t>
-      </w:r>
+      <w:proofErr w:type="spellEnd"/>
+      <w:r>
+        <w:rPr>
+          <w:lang w:val="pt-PT"/>
+        </w:rPr>
+        <w:t xml:space="preserve"> dos </w:t>
+      </w:r>
+      <w:proofErr w:type="spellStart"/>
+      <w:r>
+        <w:rPr>
+          <w:lang w:val="pt-PT"/>
+        </w:rPr>
+        <w:t>hosts</w:t>
+      </w:r>
+      <w:proofErr w:type="spellEnd"/>
+      <w:r>
+        <w:rPr>
+          <w:lang w:val="pt-PT"/>
+        </w:rPr>
+        <w:t xml:space="preserve"> dessa VLAN. Faz o </w:t>
+      </w:r>
+      <w:proofErr w:type="spellStart"/>
       <w:r>
         <w:rPr>
           <w:b/>
           <w:lang w:val="pt-PT"/>
         </w:rPr>
-        <w:t>routing entre VLANs</w:t>
-      </w:r>
-      <w:r>
-        <w:rPr>
-          <w:lang w:val="pt-PT"/>
-        </w:rPr>
-        <w:t>: um host da VLAN 2 chega a um da VLAN 3 através das SVIs.</w:t>
+        <w:t>routing</w:t>
+      </w:r>
+      <w:proofErr w:type="spellEnd"/>
+      <w:r>
+        <w:rPr>
+          <w:b/>
+          <w:lang w:val="pt-PT"/>
+        </w:rPr>
+        <w:t xml:space="preserve"> entre </w:t>
+      </w:r>
+      <w:proofErr w:type="spellStart"/>
+      <w:r>
+        <w:rPr>
+          <w:b/>
+          <w:lang w:val="pt-PT"/>
+        </w:rPr>
+        <w:t>VLANs</w:t>
+      </w:r>
+      <w:proofErr w:type="spellEnd"/>
+      <w:r>
+        <w:rPr>
+          <w:lang w:val="pt-PT"/>
+        </w:rPr>
+        <w:t xml:space="preserve">: um </w:t>
+      </w:r>
+      <w:proofErr w:type="spellStart"/>
+      <w:r>
+        <w:rPr>
+          <w:lang w:val="pt-PT"/>
+        </w:rPr>
+        <w:t>host</w:t>
+      </w:r>
+      <w:proofErr w:type="spellEnd"/>
+      <w:r>
+        <w:rPr>
+          <w:lang w:val="pt-PT"/>
+        </w:rPr>
+        <w:t xml:space="preserve"> da VLAN 2 chega a um da VLAN 3 através das </w:t>
+      </w:r>
+      <w:proofErr w:type="spellStart"/>
+      <w:r>
+        <w:rPr>
+          <w:lang w:val="pt-PT"/>
+        </w:rPr>
+        <w:t>SVIs</w:t>
+      </w:r>
+      <w:proofErr w:type="spellEnd"/>
+      <w:r>
+        <w:rPr>
+          <w:lang w:val="pt-PT"/>
+        </w:rPr>
+        <w:t>.</w:t>
       </w:r>
     </w:p>
     <w:p>
@@ -2993,7 +3772,15 @@
         <w:pStyle w:val="Ttulo3"/>
       </w:pPr>
       <w:r>
-        <w:t>OSPF (Parte A)</w:t>
+        <w:t>OSPF (</w:t>
+      </w:r>
+      <w:proofErr w:type="spellStart"/>
+      <w:r>
+        <w:t>Parte</w:t>
+      </w:r>
+      <w:proofErr w:type="spellEnd"/>
+      <w:r>
+        <w:t xml:space="preserve"> A)</w:t>
       </w:r>
     </w:p>
     <w:p>
@@ -3012,13 +3799,99 @@
           <w:b/>
           <w:lang w:val="pt-PT"/>
         </w:rPr>
-        <w:t>Área 0 (backbone):</w:t>
-      </w:r>
-      <w:r>
-        <w:rPr>
-          <w:lang w:val="pt-PT"/>
-        </w:rPr>
-        <w:t xml:space="preserve"> spines, rack, Border, as loopbacks e os uplinks das distribuições (</w:t>
+        <w:t>Área 0 (</w:t>
+      </w:r>
+      <w:proofErr w:type="spellStart"/>
+      <w:r>
+        <w:rPr>
+          <w:b/>
+          <w:lang w:val="pt-PT"/>
+        </w:rPr>
+        <w:t>backbone</w:t>
+      </w:r>
+      <w:proofErr w:type="spellEnd"/>
+      <w:r>
+        <w:rPr>
+          <w:b/>
+          <w:lang w:val="pt-PT"/>
+        </w:rPr>
+        <w:t>):</w:t>
+      </w:r>
+      <w:r>
+        <w:rPr>
+          <w:lang w:val="pt-PT"/>
+        </w:rPr>
+        <w:t xml:space="preserve"> </w:t>
+      </w:r>
+      <w:proofErr w:type="spellStart"/>
+      <w:r>
+        <w:rPr>
+          <w:lang w:val="pt-PT"/>
+        </w:rPr>
+        <w:t>spines</w:t>
+      </w:r>
+      <w:proofErr w:type="spellEnd"/>
+      <w:r>
+        <w:rPr>
+          <w:lang w:val="pt-PT"/>
+        </w:rPr>
+        <w:t xml:space="preserve">, </w:t>
+      </w:r>
+      <w:proofErr w:type="spellStart"/>
+      <w:r>
+        <w:rPr>
+          <w:lang w:val="pt-PT"/>
+        </w:rPr>
+        <w:t>rack</w:t>
+      </w:r>
+      <w:proofErr w:type="spellEnd"/>
+      <w:r>
+        <w:rPr>
+          <w:lang w:val="pt-PT"/>
+        </w:rPr>
+        <w:t xml:space="preserve">, </w:t>
+      </w:r>
+      <w:proofErr w:type="spellStart"/>
+      <w:r>
+        <w:rPr>
+          <w:lang w:val="pt-PT"/>
+        </w:rPr>
+        <w:t>Border</w:t>
+      </w:r>
+      <w:proofErr w:type="spellEnd"/>
+      <w:r>
+        <w:rPr>
+          <w:lang w:val="pt-PT"/>
+        </w:rPr>
+        <w:t xml:space="preserve">, as </w:t>
+      </w:r>
+      <w:proofErr w:type="spellStart"/>
+      <w:r>
+        <w:rPr>
+          <w:lang w:val="pt-PT"/>
+        </w:rPr>
+        <w:t>loopbacks</w:t>
+      </w:r>
+      <w:proofErr w:type="spellEnd"/>
+      <w:r>
+        <w:rPr>
+          <w:lang w:val="pt-PT"/>
+        </w:rPr>
+        <w:t xml:space="preserve"> e os </w:t>
+      </w:r>
+      <w:proofErr w:type="spellStart"/>
+      <w:r>
+        <w:rPr>
+          <w:lang w:val="pt-PT"/>
+        </w:rPr>
+        <w:t>uplinks</w:t>
+      </w:r>
+      <w:proofErr w:type="spellEnd"/>
+      <w:r>
+        <w:rPr>
+          <w:lang w:val="pt-PT"/>
+        </w:rPr>
+        <w:t xml:space="preserve"> das distribuições (</w:t>
       </w:r>
       <w:r>
         <w:rPr>
@@ -3069,7 +3942,21 @@
         <w:rPr>
           <w:lang w:val="pt-PT"/>
         </w:rPr>
-        <w:t xml:space="preserve"> só as SVIs (</w:t>
+        <w:t xml:space="preserve"> só as </w:t>
+      </w:r>
+      <w:proofErr w:type="spellStart"/>
+      <w:r>
+        <w:rPr>
+          <w:lang w:val="pt-PT"/>
+        </w:rPr>
+        <w:t>SVIs</w:t>
+      </w:r>
+      <w:proofErr w:type="spellEnd"/>
+      <w:r>
+        <w:rPr>
+          <w:lang w:val="pt-PT"/>
+        </w:rPr>
+        <w:t xml:space="preserve"> (</w:t>
       </w:r>
       <w:r>
         <w:rPr>
@@ -3146,7 +4033,21 @@
         <w:rPr>
           <w:lang w:val="pt-PT"/>
         </w:rPr>
-        <w:t xml:space="preserve"> (ligam a área 1 à área 0) e o Border é </w:t>
+        <w:t xml:space="preserve"> e o </w:t>
+      </w:r>
+      <w:proofErr w:type="spellStart"/>
+      <w:r>
+        <w:rPr>
+          <w:lang w:val="pt-PT"/>
+        </w:rPr>
+        <w:t>Border</w:t>
+      </w:r>
+      <w:proofErr w:type="spellEnd"/>
+      <w:r>
+        <w:rPr>
+          <w:lang w:val="pt-PT"/>
+        </w:rPr>
+        <w:t xml:space="preserve"> é </w:t>
       </w:r>
       <w:r>
         <w:rPr>
@@ -3159,7 +4060,7 @@
         <w:rPr>
           <w:lang w:val="pt-PT"/>
         </w:rPr>
-        <w:t xml:space="preserve"> (injeta a rota por omissão).</w:t>
+        <w:t xml:space="preserve"> </w:t>
       </w:r>
     </w:p>
     <w:p>
@@ -3176,28 +4077,56 @@
       <w:r>
         <w:rPr>
           <w:b/>
-          <w:lang w:val="pt-PT"/>
         </w:rPr>
         <w:t>Links entre routers:</w:t>
       </w:r>
       <w:r>
-        <w:rPr>
-          <w:lang w:val="pt-PT"/>
-        </w:rPr>
         <w:t xml:space="preserve"> </w:t>
       </w:r>
       <w:r>
         <w:rPr>
           <w:rStyle w:val="CodeChar"/>
-          <w:lang w:val="pt-PT"/>
         </w:rPr>
         <w:t>network point-to-point</w:t>
       </w:r>
       <w:r>
-        <w:rPr>
-          <w:lang w:val="pt-PT"/>
-        </w:rPr>
-        <w:t>, para não elegerem DR/BDR. O FRR assume broadcast por omissão, e aqui só há dois routers por link.</w:t>
+        <w:t xml:space="preserve">, para </w:t>
+      </w:r>
+      <w:proofErr w:type="spellStart"/>
+      <w:r>
+        <w:t>não</w:t>
+      </w:r>
+      <w:proofErr w:type="spellEnd"/>
+      <w:r>
+        <w:t xml:space="preserve"> </w:t>
+      </w:r>
+      <w:proofErr w:type="spellStart"/>
+      <w:r>
+        <w:t>elegerem</w:t>
+      </w:r>
+      <w:proofErr w:type="spellEnd"/>
+      <w:r>
+        <w:t xml:space="preserve"> DR/BDR. </w:t>
+      </w:r>
+      <w:r>
+        <w:rPr>
+          <w:lang w:val="pt-PT"/>
+        </w:rPr>
+        <w:t xml:space="preserve">O FRR assume </w:t>
+      </w:r>
+      <w:proofErr w:type="spellStart"/>
+      <w:r>
+        <w:rPr>
+          <w:lang w:val="pt-PT"/>
+        </w:rPr>
+        <w:t>broadcast</w:t>
+      </w:r>
+      <w:proofErr w:type="spellEnd"/>
+      <w:r>
+        <w:rPr>
+          <w:lang w:val="pt-PT"/>
+        </w:rPr>
+        <w:t xml:space="preserve"> por omissão, e aqui só há dois routers por link.</w:t>
       </w:r>
     </w:p>
     <w:p>
@@ -3220,10 +4149,89 @@
         <w:rPr>
           <w:lang w:val="pt-PT"/>
         </w:rPr>
-        <w:t xml:space="preserve"> nas SVIs, nas loopbacks e na porta do rack para o servidor. </w:t>
-      </w:r>
-      <w:r>
-        <w:t>Anunciam a rede mas não formam vizinhanças ali.</w:t>
+        <w:t xml:space="preserve"> nas </w:t>
+      </w:r>
+      <w:proofErr w:type="spellStart"/>
+      <w:r>
+        <w:rPr>
+          <w:lang w:val="pt-PT"/>
+        </w:rPr>
+        <w:t>SVIs</w:t>
+      </w:r>
+      <w:proofErr w:type="spellEnd"/>
+      <w:r>
+        <w:rPr>
+          <w:lang w:val="pt-PT"/>
+        </w:rPr>
+        <w:t xml:space="preserve">, nas </w:t>
+      </w:r>
+      <w:proofErr w:type="spellStart"/>
+      <w:r>
+        <w:rPr>
+          <w:lang w:val="pt-PT"/>
+        </w:rPr>
+        <w:t>loopbacks</w:t>
+      </w:r>
+      <w:proofErr w:type="spellEnd"/>
+      <w:r>
+        <w:rPr>
+          <w:lang w:val="pt-PT"/>
+        </w:rPr>
+        <w:t xml:space="preserve"> e na porta do </w:t>
+      </w:r>
+      <w:proofErr w:type="spellStart"/>
+      <w:r>
+        <w:rPr>
+          <w:lang w:val="pt-PT"/>
+        </w:rPr>
+        <w:t>rack</w:t>
+      </w:r>
+      <w:proofErr w:type="spellEnd"/>
+      <w:r>
+        <w:rPr>
+          <w:lang w:val="pt-PT"/>
+        </w:rPr>
+        <w:t xml:space="preserve"> para o servidor. </w:t>
+      </w:r>
+      <w:proofErr w:type="spellStart"/>
+      <w:r>
+        <w:t>Anunciam</w:t>
+      </w:r>
+      <w:proofErr w:type="spellEnd"/>
+      <w:r>
+        <w:t xml:space="preserve"> a rede mas </w:t>
+      </w:r>
+      <w:proofErr w:type="spellStart"/>
+      <w:r>
+        <w:t>não</w:t>
+      </w:r>
+      <w:proofErr w:type="spellEnd"/>
+      <w:r>
+        <w:t xml:space="preserve"> </w:t>
+      </w:r>
+      <w:proofErr w:type="spellStart"/>
+      <w:r>
+        <w:t>formam</w:t>
+      </w:r>
+      <w:proofErr w:type="spellEnd"/>
+      <w:r>
+        <w:t xml:space="preserve"> </w:t>
+      </w:r>
+      <w:proofErr w:type="spellStart"/>
+      <w:r>
+        <w:t>vizinhanças</w:t>
+      </w:r>
+      <w:proofErr w:type="spellEnd"/>
+      <w:r>
+        <w:t xml:space="preserve"> </w:t>
+      </w:r>
+      <w:proofErr w:type="spellStart"/>
+      <w:r>
+        <w:t>ali</w:t>
+      </w:r>
+      <w:proofErr w:type="spellEnd"/>
+      <w:r>
+        <w:t>.</w:t>
       </w:r>
     </w:p>
     <w:p>
@@ -3250,12 +4258,21 @@
         </w:rPr>
         <w:t xml:space="preserve"> </w:t>
       </w:r>
+      <w:proofErr w:type="spellStart"/>
       <w:r>
         <w:rPr>
           <w:rStyle w:val="CodeChar"/>
           <w:lang w:val="pt-PT"/>
         </w:rPr>
-        <w:t>area 1 range 10.8.0.0/22</w:t>
+        <w:t>area</w:t>
+      </w:r>
+      <w:proofErr w:type="spellEnd"/>
+      <w:r>
+        <w:rPr>
+          <w:rStyle w:val="CodeChar"/>
+          <w:lang w:val="pt-PT"/>
+        </w:rPr>
+        <w:t xml:space="preserve"> 1 range 10.8.0.0/22</w:t>
       </w:r>
       <w:r>
         <w:rPr>
@@ -3288,7 +4305,21 @@
         <w:rPr>
           <w:lang w:val="pt-PT"/>
         </w:rPr>
-        <w:t xml:space="preserve">O Border injeta </w:t>
+        <w:t xml:space="preserve">O </w:t>
+      </w:r>
+      <w:proofErr w:type="spellStart"/>
+      <w:r>
+        <w:rPr>
+          <w:lang w:val="pt-PT"/>
+        </w:rPr>
+        <w:t>Border</w:t>
+      </w:r>
+      <w:proofErr w:type="spellEnd"/>
+      <w:r>
+        <w:rPr>
+          <w:lang w:val="pt-PT"/>
+        </w:rPr>
+        <w:t xml:space="preserve"> injeta </w:t>
       </w:r>
       <w:r>
         <w:rPr>
@@ -3303,19 +4334,54 @@
         </w:rPr>
         <w:t xml:space="preserve"> com </w:t>
       </w:r>
+      <w:proofErr w:type="spellStart"/>
       <w:r>
         <w:rPr>
           <w:rStyle w:val="CodeChar"/>
           <w:lang w:val="pt-PT"/>
         </w:rPr>
-        <w:t>default-information originate always</w:t>
-      </w:r>
+        <w:t>default-information</w:t>
+      </w:r>
+      <w:proofErr w:type="spellEnd"/>
+      <w:r>
+        <w:rPr>
+          <w:rStyle w:val="CodeChar"/>
+          <w:lang w:val="pt-PT"/>
+        </w:rPr>
+        <w:t xml:space="preserve"> </w:t>
+      </w:r>
+      <w:proofErr w:type="spellStart"/>
+      <w:r>
+        <w:rPr>
+          <w:rStyle w:val="CodeChar"/>
+          <w:lang w:val="pt-PT"/>
+        </w:rPr>
+        <w:t>originate</w:t>
+      </w:r>
+      <w:proofErr w:type="spellEnd"/>
+      <w:r>
+        <w:rPr>
+          <w:rStyle w:val="CodeChar"/>
+          <w:lang w:val="pt-PT"/>
+        </w:rPr>
+        <w:t xml:space="preserve"> </w:t>
+      </w:r>
+      <w:proofErr w:type="spellStart"/>
+      <w:r>
+        <w:rPr>
+          <w:rStyle w:val="CodeChar"/>
+          <w:lang w:val="pt-PT"/>
+        </w:rPr>
+        <w:t>always</w:t>
+      </w:r>
+      <w:proofErr w:type="spellEnd"/>
       <w:r>
         <w:rPr>
           <w:lang w:val="pt-PT"/>
         </w:rPr>
         <w:t xml:space="preserve">. Tem de ser </w:t>
       </w:r>
+      <w:proofErr w:type="spellStart"/>
       <w:r>
         <w:rPr>
           <w:rStyle w:val="CodeChar"/>
@@ -3323,24 +4389,52 @@
         </w:rPr>
         <w:t>always</w:t>
       </w:r>
-      <w:r>
-        <w:rPr>
-          <w:lang w:val="pt-PT"/>
-        </w:rPr>
-        <w:t xml:space="preserve"> porque a Internet é simulada e o Border não tem uma default real para redistribuir. Os outros routers aprendem-na como </w:t>
-      </w:r>
-      <w:r>
-        <w:rPr>
-          <w:b/>
-          <w:lang w:val="pt-PT"/>
-        </w:rPr>
-        <w:t>externa tipo E2</w:t>
-      </w:r>
-      <w:r>
-        <w:rPr>
-          <w:lang w:val="pt-PT"/>
-        </w:rPr>
-        <w:t xml:space="preserve">. A </w:t>
+      <w:proofErr w:type="spellEnd"/>
+      <w:r>
+        <w:rPr>
+          <w:lang w:val="pt-PT"/>
+        </w:rPr>
+        <w:t xml:space="preserve"> porque a Internet é simulada e o </w:t>
+      </w:r>
+      <w:proofErr w:type="spellStart"/>
+      <w:r>
+        <w:rPr>
+          <w:lang w:val="pt-PT"/>
+        </w:rPr>
+        <w:t>Border</w:t>
+      </w:r>
+      <w:proofErr w:type="spellEnd"/>
+      <w:r>
+        <w:rPr>
+          <w:lang w:val="pt-PT"/>
+        </w:rPr>
+        <w:t xml:space="preserve"> não tem uma </w:t>
+      </w:r>
+      <w:proofErr w:type="spellStart"/>
+      <w:r>
+        <w:rPr>
+          <w:lang w:val="pt-PT"/>
+        </w:rPr>
+        <w:t>default</w:t>
+      </w:r>
+      <w:proofErr w:type="spellEnd"/>
+      <w:r>
+        <w:rPr>
+          <w:lang w:val="pt-PT"/>
+        </w:rPr>
+        <w:t xml:space="preserve"> real para redistribuir</w:t>
+      </w:r>
+      <w:r>
+        <w:rPr>
+          <w:lang w:val="pt-PT"/>
+        </w:rPr>
+        <w:t>.</w:t>
+      </w:r>
+      <w:r>
+        <w:rPr>
+          <w:lang w:val="pt-PT"/>
+        </w:rPr>
+        <w:t xml:space="preserve"> A </w:t>
       </w:r>
       <w:r>
         <w:rPr>
@@ -3353,7 +4447,21 @@
         <w:rPr>
           <w:lang w:val="pt-PT"/>
         </w:rPr>
-        <w:t xml:space="preserve"> do Border (</w:t>
+        <w:t xml:space="preserve"> do </w:t>
+      </w:r>
+      <w:proofErr w:type="spellStart"/>
+      <w:r>
+        <w:rPr>
+          <w:lang w:val="pt-PT"/>
+        </w:rPr>
+        <w:t>Border</w:t>
+      </w:r>
+      <w:proofErr w:type="spellEnd"/>
+      <w:r>
+        <w:rPr>
+          <w:lang w:val="pt-PT"/>
+        </w:rPr>
+        <w:t xml:space="preserve"> (</w:t>
       </w:r>
       <w:r>
         <w:rPr>
@@ -3380,7 +4488,35 @@
         <w:rPr>
           <w:lang w:val="pt-PT"/>
         </w:rPr>
-        <w:t>5. DHCP: servidor no datacenter, relay nas distribuições</w:t>
+        <w:t xml:space="preserve">5. DHCP: servidor no </w:t>
+      </w:r>
+      <w:proofErr w:type="spellStart"/>
+      <w:r>
+        <w:rPr>
+          <w:lang w:val="pt-PT"/>
+        </w:rPr>
+        <w:t>datacenter</w:t>
+      </w:r>
+      <w:proofErr w:type="spellEnd"/>
+      <w:r>
+        <w:rPr>
+          <w:lang w:val="pt-PT"/>
+        </w:rPr>
+        <w:t xml:space="preserve">, </w:t>
+      </w:r>
+      <w:proofErr w:type="spellStart"/>
+      <w:r>
+        <w:rPr>
+          <w:lang w:val="pt-PT"/>
+        </w:rPr>
+        <w:t>relay</w:t>
+      </w:r>
+      <w:proofErr w:type="spellEnd"/>
+      <w:r>
+        <w:rPr>
+          <w:lang w:val="pt-PT"/>
+        </w:rPr>
+        <w:t xml:space="preserve"> nas distribuições</w:t>
       </w:r>
     </w:p>
     <w:p>
@@ -3395,6 +4531,7 @@
         </w:rPr>
         <w:t xml:space="preserve">O pedido DHCP é </w:t>
       </w:r>
+      <w:proofErr w:type="spellStart"/>
       <w:r>
         <w:rPr>
           <w:i/>
@@ -3402,11 +4539,26 @@
         </w:rPr>
         <w:t>broadcast</w:t>
       </w:r>
-      <w:r>
-        <w:rPr>
-          <w:lang w:val="pt-PT"/>
-        </w:rPr>
-        <w:t xml:space="preserve"> e não atravessa um router, por isso a SVI da distribuição recebe-o e reencaminha-o em unicast para o servidor.</w:t>
+      <w:proofErr w:type="spellEnd"/>
+      <w:r>
+        <w:rPr>
+          <w:lang w:val="pt-PT"/>
+        </w:rPr>
+        <w:t xml:space="preserve"> e não atravessa um router, por isso a SVI da distribuição recebe-o e reencaminha-o em </w:t>
+      </w:r>
+      <w:proofErr w:type="spellStart"/>
+      <w:r>
+        <w:rPr>
+          <w:lang w:val="pt-PT"/>
+        </w:rPr>
+        <w:t>unicast</w:t>
+      </w:r>
+      <w:proofErr w:type="spellEnd"/>
+      <w:r>
+        <w:rPr>
+          <w:lang w:val="pt-PT"/>
+        </w:rPr>
+        <w:t xml:space="preserve"> para o servidor.</w:t>
       </w:r>
     </w:p>
     <w:p>
@@ -3431,7 +4583,21 @@
         <w:rPr>
           <w:lang w:val="pt-PT"/>
         </w:rPr>
-        <w:t xml:space="preserve"> no DatacenterRack (</w:t>
+        <w:t xml:space="preserve"> no </w:t>
+      </w:r>
+      <w:proofErr w:type="spellStart"/>
+      <w:r>
+        <w:rPr>
+          <w:lang w:val="pt-PT"/>
+        </w:rPr>
+        <w:t>DatacenterRack</w:t>
+      </w:r>
+      <w:proofErr w:type="spellEnd"/>
+      <w:r>
+        <w:rPr>
+          <w:lang w:val="pt-PT"/>
+        </w:rPr>
+        <w:t xml:space="preserve"> (</w:t>
       </w:r>
       <w:r>
         <w:rPr>
@@ -3444,7 +4610,35 @@
         <w:rPr>
           <w:lang w:val="pt-PT"/>
         </w:rPr>
-        <w:t>): ISC dhcpd a escutar nas 4 interfaces para os spines (</w:t>
+        <w:t xml:space="preserve">): ISC </w:t>
+      </w:r>
+      <w:proofErr w:type="spellStart"/>
+      <w:r>
+        <w:rPr>
+          <w:lang w:val="pt-PT"/>
+        </w:rPr>
+        <w:t>dhcpd</w:t>
+      </w:r>
+      <w:proofErr w:type="spellEnd"/>
+      <w:r>
+        <w:rPr>
+          <w:lang w:val="pt-PT"/>
+        </w:rPr>
+        <w:t xml:space="preserve"> a escutar nas 4 interfaces para os </w:t>
+      </w:r>
+      <w:proofErr w:type="spellStart"/>
+      <w:r>
+        <w:rPr>
+          <w:lang w:val="pt-PT"/>
+        </w:rPr>
+        <w:t>spines</w:t>
+      </w:r>
+      <w:proofErr w:type="spellEnd"/>
+      <w:r>
+        <w:rPr>
+          <w:lang w:val="pt-PT"/>
+        </w:rPr>
+        <w:t xml:space="preserve"> (</w:t>
       </w:r>
       <w:r>
         <w:rPr>
@@ -3496,7 +4690,21 @@
         <w:rPr>
           <w:lang w:val="pt-PT"/>
         </w:rPr>
-        <w:t>). Tem um pool por VLAN (as gamas e os gateways da secção 2).</w:t>
+        <w:t xml:space="preserve">). Tem um pool por VLAN (as gamas e os </w:t>
+      </w:r>
+      <w:proofErr w:type="spellStart"/>
+      <w:r>
+        <w:rPr>
+          <w:lang w:val="pt-PT"/>
+        </w:rPr>
+        <w:t>gateways</w:t>
+      </w:r>
+      <w:proofErr w:type="spellEnd"/>
+      <w:r>
+        <w:rPr>
+          <w:lang w:val="pt-PT"/>
+        </w:rPr>
+        <w:t xml:space="preserve"> da secção 2).</w:t>
       </w:r>
     </w:p>
     <w:p>
@@ -3523,6 +4731,7 @@
         </w:rPr>
         <w:t xml:space="preserve"> nas duas distribuições (</w:t>
       </w:r>
+      <w:proofErr w:type="spellStart"/>
       <w:r>
         <w:rPr>
           <w:rStyle w:val="CodeChar"/>
@@ -3530,6 +4739,7 @@
         </w:rPr>
         <w:t>isc-dhcp-relay</w:t>
       </w:r>
+      <w:proofErr w:type="spellEnd"/>
       <w:r>
         <w:rPr>
           <w:lang w:val="pt-PT"/>
@@ -3547,14 +4757,44 @@
         <w:rPr>
           <w:lang w:val="pt-PT"/>
         </w:rPr>
-        <w:t xml:space="preserve"> (as SVIs, nos dois sentidos) e </w:t>
+        <w:t xml:space="preserve"> (as </w:t>
+      </w:r>
+      <w:proofErr w:type="spellStart"/>
+      <w:r>
+        <w:rPr>
+          <w:lang w:val="pt-PT"/>
+        </w:rPr>
+        <w:t>SVIs</w:t>
+      </w:r>
+      <w:proofErr w:type="spellEnd"/>
+      <w:r>
+        <w:rPr>
+          <w:lang w:val="pt-PT"/>
+        </w:rPr>
+        <w:t xml:space="preserve">, nos dois sentidos) e </w:t>
       </w:r>
       <w:r>
         <w:rPr>
           <w:rStyle w:val="CodeChar"/>
           <w:lang w:val="pt-PT"/>
         </w:rPr>
-        <w:t>-iu swp7</w:t>
+        <w:t>-</w:t>
+      </w:r>
+      <w:proofErr w:type="spellStart"/>
+      <w:r>
+        <w:rPr>
+          <w:rStyle w:val="CodeChar"/>
+          <w:lang w:val="pt-PT"/>
+        </w:rPr>
+        <w:t>iu</w:t>
+      </w:r>
+      <w:proofErr w:type="spellEnd"/>
+      <w:r>
+        <w:rPr>
+          <w:rStyle w:val="CodeChar"/>
+          <w:lang w:val="pt-PT"/>
+        </w:rPr>
+        <w:t xml:space="preserve"> swp7</w:t>
       </w:r>
       <w:r>
         <w:rPr>
@@ -3567,13 +4807,43 @@
           <w:rStyle w:val="CodeChar"/>
           <w:lang w:val="pt-PT"/>
         </w:rPr>
-        <w:t>-iu swp10</w:t>
-      </w:r>
-      <w:r>
-        <w:rPr>
-          <w:lang w:val="pt-PT"/>
-        </w:rPr>
-        <w:t xml:space="preserve"> (os uplinks, para o lado do servidor).</w:t>
+        <w:t>-</w:t>
+      </w:r>
+      <w:proofErr w:type="spellStart"/>
+      <w:r>
+        <w:rPr>
+          <w:rStyle w:val="CodeChar"/>
+          <w:lang w:val="pt-PT"/>
+        </w:rPr>
+        <w:t>iu</w:t>
+      </w:r>
+      <w:proofErr w:type="spellEnd"/>
+      <w:r>
+        <w:rPr>
+          <w:rStyle w:val="CodeChar"/>
+          <w:lang w:val="pt-PT"/>
+        </w:rPr>
+        <w:t xml:space="preserve"> swp10</w:t>
+      </w:r>
+      <w:r>
+        <w:rPr>
+          <w:lang w:val="pt-PT"/>
+        </w:rPr>
+        <w:t xml:space="preserve"> (os </w:t>
+      </w:r>
+      <w:proofErr w:type="spellStart"/>
+      <w:r>
+        <w:rPr>
+          <w:lang w:val="pt-PT"/>
+        </w:rPr>
+        <w:t>uplinks</w:t>
+      </w:r>
+      <w:proofErr w:type="spellEnd"/>
+      <w:r>
+        <w:rPr>
+          <w:lang w:val="pt-PT"/>
+        </w:rPr>
+        <w:t>, para o lado do servidor).</w:t>
       </w:r>
     </w:p>
     <w:p>
@@ -3587,73 +4857,41 @@
           <w:lang w:val="pt-PT"/>
         </w:rPr>
       </w:pPr>
+      <w:proofErr w:type="spellStart"/>
       <w:r>
         <w:rPr>
           <w:b/>
           <w:lang w:val="pt-PT"/>
         </w:rPr>
-        <w:t xml:space="preserve">Porquê </w:t>
-      </w:r>
-      <w:r>
-        <w:rPr>
-          <w:rStyle w:val="CodeChar"/>
+        <w:t>Hosts</w:t>
+      </w:r>
+      <w:proofErr w:type="spellEnd"/>
+      <w:r>
+        <w:rPr>
           <w:b/>
           <w:lang w:val="pt-PT"/>
         </w:rPr>
-        <w:t>-i</w:t>
-      </w:r>
-      <w:r>
-        <w:rPr>
-          <w:b/>
-          <w:lang w:val="pt-PT"/>
-        </w:rPr>
-        <w:t xml:space="preserve"> e não só </w:t>
-      </w:r>
-      <w:r>
-        <w:rPr>
-          <w:rStyle w:val="CodeChar"/>
-          <w:b/>
-          <w:lang w:val="pt-PT"/>
-        </w:rPr>
-        <w:t>-id</w:t>
-      </w:r>
-      <w:r>
-        <w:rPr>
-          <w:b/>
-          <w:lang w:val="pt-PT"/>
-        </w:rPr>
         <w:t>:</w:t>
       </w:r>
       <w:r>
         <w:rPr>
           <w:lang w:val="pt-PT"/>
         </w:rPr>
-        <w:t xml:space="preserve"> as duas distribuições estão na mesma VLAN, e a resposta do servidor pode chegar à outra distribuição.</w:t>
-      </w:r>
-    </w:p>
-    <w:p>
-      <w:pPr>
-        <w:pStyle w:val="PargrafodaLista"/>
-        <w:numPr>
-          <w:ilvl w:val="0"/>
-          <w:numId w:val="7"/>
-        </w:numPr>
-        <w:rPr>
-          <w:lang w:val="pt-PT"/>
-        </w:rPr>
-      </w:pPr>
-      <w:r>
-        <w:rPr>
-          <w:b/>
-          <w:lang w:val="pt-PT"/>
-        </w:rPr>
-        <w:t>Hosts:</w:t>
-      </w:r>
-      <w:r>
-        <w:rPr>
-          <w:lang w:val="pt-PT"/>
-        </w:rPr>
-        <w:t xml:space="preserve"> o cliente DHCP arranca com o nó, e cada host fica com um só endereço.</w:t>
+        <w:t xml:space="preserve"> o cliente DHCP arranca com o nó, e cada </w:t>
+      </w:r>
+      <w:proofErr w:type="spellStart"/>
+      <w:r>
+        <w:rPr>
+          <w:lang w:val="pt-PT"/>
+        </w:rPr>
+        <w:t>host</w:t>
+      </w:r>
+      <w:proofErr w:type="spellEnd"/>
+      <w:r>
+        <w:rPr>
+          <w:lang w:val="pt-PT"/>
+        </w:rPr>
+        <w:t xml:space="preserve"> fica com um só endereço.</w:t>
       </w:r>
     </w:p>
     <w:p>
@@ -3680,7 +4918,35 @@
         <w:rPr>
           <w:lang w:val="pt-PT"/>
         </w:rPr>
-        <w:t>No cenário 2 cada VLAN existe num só acesso, por isso os bonds carregam menos VLANs. O L2 continua a chegar às distribuições, e o resto (L3, OSPF, DHCP) fica igual.</w:t>
+        <w:t xml:space="preserve">No cenário 2 cada VLAN existe num só acesso, por isso os </w:t>
+      </w:r>
+      <w:proofErr w:type="spellStart"/>
+      <w:r>
+        <w:rPr>
+          <w:lang w:val="pt-PT"/>
+        </w:rPr>
+        <w:t>bonds</w:t>
+      </w:r>
+      <w:proofErr w:type="spellEnd"/>
+      <w:r>
+        <w:rPr>
+          <w:lang w:val="pt-PT"/>
+        </w:rPr>
+        <w:t xml:space="preserve"> carregam menos </w:t>
+      </w:r>
+      <w:proofErr w:type="spellStart"/>
+      <w:r>
+        <w:rPr>
+          <w:lang w:val="pt-PT"/>
+        </w:rPr>
+        <w:t>VLANs</w:t>
+      </w:r>
+      <w:proofErr w:type="spellEnd"/>
+      <w:r>
+        <w:rPr>
+          <w:lang w:val="pt-PT"/>
+        </w:rPr>
+        <w:t>. O L2 continua a chegar às distribuições, e o resto (L3, OSPF, DHCP) fica igual.</w:t>
       </w:r>
     </w:p>
     <w:tbl>
@@ -3718,8 +4984,13 @@
             <w:shd w:val="clear" w:color="auto" w:fill="F2F2F2"/>
           </w:tcPr>
           <w:p>
-            <w:r>
-              <w:t>Cenário 1</w:t>
+            <w:proofErr w:type="spellStart"/>
+            <w:r>
+              <w:t>Cenário</w:t>
+            </w:r>
+            <w:proofErr w:type="spellEnd"/>
+            <w:r>
+              <w:t xml:space="preserve"> 1</w:t>
             </w:r>
           </w:p>
         </w:tc>
@@ -3729,8 +5000,13 @@
             <w:shd w:val="clear" w:color="auto" w:fill="F2F2F2"/>
           </w:tcPr>
           <w:p>
-            <w:r>
-              <w:t>Cenário 2</w:t>
+            <w:proofErr w:type="spellStart"/>
+            <w:r>
+              <w:t>Cenário</w:t>
+            </w:r>
+            <w:proofErr w:type="spellEnd"/>
+            <w:r>
+              <w:t xml:space="preserve"> 2</w:t>
             </w:r>
           </w:p>
         </w:tc>
@@ -3742,8 +5018,21 @@
           </w:tcPr>
           <w:p>
             <w:r>
-              <w:t>VLANs nos acessos</w:t>
-            </w:r>
+              <w:t xml:space="preserve">VLANs </w:t>
+            </w:r>
+            <w:proofErr w:type="spellStart"/>
+            <w:r>
+              <w:t>nos</w:t>
+            </w:r>
+            <w:proofErr w:type="spellEnd"/>
+            <w:r>
+              <w:t xml:space="preserve"> </w:t>
+            </w:r>
+            <w:proofErr w:type="spellStart"/>
+            <w:r>
+              <w:t>acessos</w:t>
+            </w:r>
+            <w:proofErr w:type="spellEnd"/>
           </w:p>
         </w:tc>
         <w:tc>
@@ -3756,11 +5045,19 @@
                 <w:lang w:val="pt-PT"/>
               </w:rPr>
             </w:pPr>
+            <w:proofErr w:type="spellStart"/>
             <w:r>
               <w:rPr>
                 <w:lang w:val="pt-PT"/>
               </w:rPr>
-              <w:t>VLANs 2 e 3 nos dois acessos</w:t>
+              <w:t>VLANs</w:t>
+            </w:r>
+            <w:proofErr w:type="spellEnd"/>
+            <w:r>
+              <w:rPr>
+                <w:lang w:val="pt-PT"/>
+              </w:rPr>
+              <w:t xml:space="preserve"> 2 e 3 nos dois acessos</w:t>
             </w:r>
           </w:p>
         </w:tc>
@@ -3808,7 +5105,21 @@
               <w:rPr>
                 <w:lang w:val="pt-PT"/>
               </w:rPr>
-              <w:t>cada acesso tem um host de cada VLAN (swp5 VLAN 2, swp6 VLAN 3)</w:t>
+              <w:t xml:space="preserve">cada acesso tem um </w:t>
+            </w:r>
+            <w:proofErr w:type="spellStart"/>
+            <w:r>
+              <w:rPr>
+                <w:lang w:val="pt-PT"/>
+              </w:rPr>
+              <w:t>host</w:t>
+            </w:r>
+            <w:proofErr w:type="spellEnd"/>
+            <w:r>
+              <w:rPr>
+                <w:lang w:val="pt-PT"/>
+              </w:rPr>
+              <w:t xml:space="preserve"> de cada VLAN (swp5 VLAN 2, swp6 VLAN 3)</w:t>
             </w:r>
           </w:p>
         </w:tc>
@@ -3818,7 +5129,23 @@
           </w:tcPr>
           <w:p>
             <w:r>
-              <w:t>Access1: swp5 e swp6 na VLAN 2. Access2: swp5 e swp6 na VLAN 3</w:t>
+              <w:t xml:space="preserve">Access1: swp5 e swp6 </w:t>
+            </w:r>
+            <w:proofErr w:type="spellStart"/>
+            <w:r>
+              <w:t>na</w:t>
+            </w:r>
+            <w:proofErr w:type="spellEnd"/>
+            <w:r>
+              <w:t xml:space="preserve"> VLAN 2. Access2: swp5 e swp6 </w:t>
+            </w:r>
+            <w:proofErr w:type="spellStart"/>
+            <w:r>
+              <w:t>na</w:t>
+            </w:r>
+            <w:proofErr w:type="spellEnd"/>
+            <w:r>
+              <w:t xml:space="preserve"> VLAN 3</w:t>
             </w:r>
           </w:p>
         </w:tc>
@@ -3830,7 +5157,15 @@
           </w:tcPr>
           <w:p>
             <w:r>
-              <w:t>Trunks (bonds dos acessos)</w:t>
+              <w:t xml:space="preserve">Trunks (bonds dos </w:t>
+            </w:r>
+            <w:proofErr w:type="spellStart"/>
+            <w:r>
+              <w:t>acessos</w:t>
+            </w:r>
+            <w:proofErr w:type="spellEnd"/>
+            <w:r>
+              <w:t>)</w:t>
             </w:r>
           </w:p>
         </w:tc>
@@ -3839,8 +5174,13 @@
             <w:tcW w:w="3470" w:type="dxa"/>
           </w:tcPr>
           <w:p>
-            <w:r>
-              <w:t>levam as VLANs 2 e 3</w:t>
+            <w:proofErr w:type="spellStart"/>
+            <w:r>
+              <w:t>levam</w:t>
+            </w:r>
+            <w:proofErr w:type="spellEnd"/>
+            <w:r>
+              <w:t xml:space="preserve"> as VLANs 2 e 3</w:t>
             </w:r>
           </w:p>
         </w:tc>
@@ -3870,8 +5210,21 @@
           </w:tcPr>
           <w:p>
             <w:r>
-              <w:t>Bonds nas distribuições</w:t>
-            </w:r>
+              <w:t xml:space="preserve">Bonds </w:t>
+            </w:r>
+            <w:proofErr w:type="spellStart"/>
+            <w:r>
+              <w:t>nas</w:t>
+            </w:r>
+            <w:proofErr w:type="spellEnd"/>
+            <w:r>
+              <w:t xml:space="preserve"> </w:t>
+            </w:r>
+            <w:proofErr w:type="spellStart"/>
+            <w:r>
+              <w:t>distribuições</w:t>
+            </w:r>
+            <w:proofErr w:type="spellEnd"/>
           </w:p>
         </w:tc>
         <w:tc>
@@ -3888,7 +5241,21 @@
               <w:rPr>
                 <w:lang w:val="pt-PT"/>
               </w:rPr>
-              <w:t>as VLANs 2 e 3 em todos</w:t>
+              <w:t xml:space="preserve">as </w:t>
+            </w:r>
+            <w:proofErr w:type="spellStart"/>
+            <w:r>
+              <w:rPr>
+                <w:lang w:val="pt-PT"/>
+              </w:rPr>
+              <w:t>VLANs</w:t>
+            </w:r>
+            <w:proofErr w:type="spellEnd"/>
+            <w:r>
+              <w:rPr>
+                <w:lang w:val="pt-PT"/>
+              </w:rPr>
+              <w:t xml:space="preserve"> 2 e 3 em todos</w:t>
             </w:r>
           </w:p>
         </w:tc>
@@ -3903,7 +5270,23 @@
               </w:rPr>
             </w:pPr>
             <w:r>
-              <w:t xml:space="preserve">Dist1: bond1 só VLAN 2, bond2 só VLAN 3. </w:t>
+              <w:t xml:space="preserve">Dist1: bond1 </w:t>
+            </w:r>
+            <w:proofErr w:type="spellStart"/>
+            <w:r>
+              <w:t>só</w:t>
+            </w:r>
+            <w:proofErr w:type="spellEnd"/>
+            <w:r>
+              <w:t xml:space="preserve"> VLAN 2, bond2 </w:t>
+            </w:r>
+            <w:proofErr w:type="spellStart"/>
+            <w:r>
+              <w:t>só</w:t>
+            </w:r>
+            <w:proofErr w:type="spellEnd"/>
+            <w:r>
+              <w:t xml:space="preserve"> VLAN 3. </w:t>
             </w:r>
             <w:r>
               <w:rPr>
@@ -3933,8 +5316,13 @@
             <w:tcW w:w="1646" w:type="dxa"/>
           </w:tcPr>
           <w:p>
-            <w:r>
-              <w:t>Mantém-se</w:t>
+            <w:proofErr w:type="spellStart"/>
+            <w:r>
+              <w:t>Mantém</w:t>
+            </w:r>
+            <w:proofErr w:type="spellEnd"/>
+            <w:r>
+              <w:t>-se</w:t>
             </w:r>
           </w:p>
         </w:tc>
@@ -3944,7 +5332,15 @@
           </w:tcPr>
           <w:p>
             <w:r>
-              <w:t>SVIs, OSPF, sumário, STP, relay, DHCP</w:t>
+              <w:t xml:space="preserve">SVIs, OSPF, </w:t>
+            </w:r>
+            <w:proofErr w:type="spellStart"/>
+            <w:r>
+              <w:t>sumário</w:t>
+            </w:r>
+            <w:proofErr w:type="spellEnd"/>
+            <w:r>
+              <w:t>, STP, relay, DHCP</w:t>
             </w:r>
           </w:p>
         </w:tc>
@@ -3953,148 +5349,22 @@
             <w:tcW w:w="4244" w:type="dxa"/>
           </w:tcPr>
           <w:p>
+            <w:proofErr w:type="spellStart"/>
             <w:r>
               <w:t>igual</w:t>
             </w:r>
+            <w:proofErr w:type="spellEnd"/>
           </w:p>
         </w:tc>
       </w:tr>
     </w:tbl>
     <w:p>
       <w:pPr>
-        <w:pStyle w:val="Ttulo2"/>
+        <w:pStyle w:val="PargrafodaLista"/>
+        <w:rPr>
+          <w:lang w:val="pt-PT"/>
+        </w:rPr>
       </w:pPr>
-      <w:r>
-        <w:t>7. Notas para te preparares</w:t>
-      </w:r>
-    </w:p>
-    <w:p>
-      <w:pPr>
-        <w:pStyle w:val="PargrafodaLista"/>
-        <w:numPr>
-          <w:ilvl w:val="0"/>
-          <w:numId w:val="8"/>
-        </w:numPr>
-      </w:pPr>
-      <w:r>
-        <w:rPr>
-          <w:b/>
-          <w:lang w:val="pt-PT"/>
-        </w:rPr>
-        <w:t>Trunks e não links L3 no cenário 2:</w:t>
-      </w:r>
-      <w:r>
-        <w:rPr>
-          <w:lang w:val="pt-PT"/>
-        </w:rPr>
-        <w:t xml:space="preserve"> escolhi trunks limitados porque o requisito pede as SVIs nas distribuições, o que obriga o L2 a chegar lá. </w:t>
-      </w:r>
-      <w:r>
-        <w:t>Esta leitura não está confirmada com o professor.</w:t>
-      </w:r>
-    </w:p>
-    <w:p>
-      <w:pPr>
-        <w:pStyle w:val="PargrafodaLista"/>
-        <w:numPr>
-          <w:ilvl w:val="0"/>
-          <w:numId w:val="8"/>
-        </w:numPr>
-        <w:rPr>
-          <w:lang w:val="pt-PT"/>
-        </w:rPr>
-      </w:pPr>
-      <w:r>
-        <w:rPr>
-          <w:b/>
-          <w:lang w:val="pt-PT"/>
-        </w:rPr>
-        <w:lastRenderedPageBreak/>
-        <w:t>Um só gateway por host:</w:t>
-      </w:r>
-      <w:r>
-        <w:rPr>
-          <w:lang w:val="pt-PT"/>
-        </w:rPr>
-        <w:t xml:space="preserve"> os hosts usam o </w:t>
-      </w:r>
-      <w:r>
-        <w:rPr>
-          <w:rStyle w:val="CodeChar"/>
-          <w:lang w:val="pt-PT"/>
-        </w:rPr>
-        <w:t>.1</w:t>
-      </w:r>
-      <w:r>
-        <w:rPr>
-          <w:lang w:val="pt-PT"/>
-        </w:rPr>
-        <w:t xml:space="preserve"> (Distribution1). A SVI </w:t>
-      </w:r>
-      <w:r>
-        <w:rPr>
-          <w:rStyle w:val="CodeChar"/>
-          <w:lang w:val="pt-PT"/>
-        </w:rPr>
-        <w:t>.2</w:t>
-      </w:r>
-      <w:r>
-        <w:rPr>
-          <w:lang w:val="pt-PT"/>
-        </w:rPr>
-        <w:t xml:space="preserve"> da Distribution2 existe, mas não há um protocolo de redundância de gateway (tipo VRRP), por isso os hosts não passam sozinhos para ela se a Distribution1 falhar. É uma limitação do desenho, observação minha e não do enunciado.</w:t>
-      </w:r>
-    </w:p>
-    <w:p>
-      <w:pPr>
-        <w:pStyle w:val="PargrafodaLista"/>
-        <w:numPr>
-          <w:ilvl w:val="0"/>
-          <w:numId w:val="8"/>
-        </w:numPr>
-        <w:rPr>
-          <w:lang w:val="pt-PT"/>
-        </w:rPr>
-      </w:pPr>
-      <w:r>
-        <w:rPr>
-          <w:b/>
-          <w:lang w:val="pt-PT"/>
-        </w:rPr>
-        <w:t>Prova de que a default não faz ciclo:</w:t>
-      </w:r>
-      <w:r>
-        <w:rPr>
-          <w:lang w:val="pt-PT"/>
-        </w:rPr>
-        <w:t xml:space="preserve"> o </w:t>
-      </w:r>
-      <w:r>
-        <w:rPr>
-          <w:rStyle w:val="CodeChar"/>
-          <w:lang w:val="pt-PT"/>
-        </w:rPr>
-        <w:t>traceroute 8.8.8.8</w:t>
-      </w:r>
-      <w:r>
-        <w:rPr>
-          <w:lang w:val="pt-PT"/>
-        </w:rPr>
-        <w:t xml:space="preserve"> termina no Border com </w:t>
-      </w:r>
-      <w:r>
-        <w:rPr>
-          <w:rStyle w:val="CodeChar"/>
-          <w:lang w:val="pt-PT"/>
-        </w:rPr>
-        <w:t>!N</w:t>
-      </w:r>
-      <w:r>
-        <w:rPr>
-          <w:lang w:val="pt-PT"/>
-        </w:rPr>
-        <w:t>, sem repetições.</w:t>
-      </w:r>
     </w:p>
     <w:sectPr>
       <w:pgSz w:w="12240" w:h="15840"/>

</xml_diff>